<commit_message>
docs: correct the author name to Deborah Akinbola
The name was spelled Akinbolade in the submission document. It appeared in exactly one
source file, docs/submission/build/content.py, and from there in the body and the author
metadata of both generated files. All three are corrected and the two documents are
regenerated.

git config --local user.name is now Deborah Akinbola, so every commit from here carries
it. The history is not rewritten: a hundred and twenty commits days before submission is
not worth the risk to fix a name. The submission document says so in one sentence where
the repository is named, so a reader who notices the mismatch is not left guessing.

The Word file now also carries the author in its own core properties, not only on the
page, where it had been left as python-docx.

The git config email is unchanged. It is an identifier rather than a name, and changing
it would break commit attribution on GitHub.
</commit_message>
<xml_diff>
--- a/docs/submission/CHOWLY-submission.docx
+++ b/docs/submission/CHOWLY-submission.docx
@@ -43,7 +43,7 @@
           <w:color w:val="1A1A1A"/>
           <w:sz w:val="22"/>
         </w:rPr>
-        <w:t>Deborah Akinbolade</w:t>
+        <w:t>Deborah Akinbola</w:t>
       </w:r>
     </w:p>
     <w:p>
@@ -314,6 +314,14 @@
       </w:r>
       <w:r>
         <w:rPr>
+          <w:color w:val="5A5A5A"/>
+          <w:sz w:val="19"/>
+        </w:rPr>
+        <w:br/>
+        <w:t xml:space="preserve">        A recorded walkthrough</w:t>
+      </w:r>
+      <w:r>
+        <w:rPr>
           <w:sz w:val="20"/>
         </w:rPr>
         <w:br/>
@@ -345,6 +353,14 @@
       </w:pPr>
       <w:r>
         <w:t>The codebase is at https://github.com/DebbyA007/CHOWLY. It is public, so facilitators need no invitation to read it.</w:t>
+      </w:r>
+    </w:p>
+    <w:p>
+      <w:pPr>
+        <w:jc w:val="both"/>
+      </w:pPr>
+      <w:r>
+        <w:t>The commit author name reads Deborah Akinbolade throughout the history. That is a typo in the git configuration; the correct name is Deborah Akinbola.</w:t>
       </w:r>
     </w:p>
     <w:p>
@@ -1960,6 +1976,30 @@
     </w:p>
     <w:p>
       <w:pPr>
+        <w:pStyle w:val="Heading3"/>
+      </w:pPr>
+      <w:r>
+        <w:t>A recorded walkthrough</w:t>
+      </w:r>
+    </w:p>
+    <w:p>
+      <w:pPr>
+        <w:jc w:val="both"/>
+      </w:pPr>
+      <w:r>
+        <w:t>The same pass is recorded end to end at docs/media/walkthrough.mp4 in the repository: three minutes forty five, one continuous take on the deployed app, no cuts and no second tab.</w:t>
+      </w:r>
+    </w:p>
+    <w:p>
+      <w:pPr>
+        <w:jc w:val="both"/>
+      </w:pPr>
+      <w:r>
+        <w:t>Order #1009 in the live data is the order that recording pays for, kept deliberately so the walkthrough can be checked against it; only its receipt number differs, reading 0006 now rather than the 0007 in the video, because that number is the payment's place in the sequence of payments and the test payments recorded around it have since been removed.</w:t>
+      </w:r>
+    </w:p>
+    <w:p>
+      <w:pPr>
         <w:pStyle w:val="Heading2"/>
       </w:pPr>
       <w:r>

</xml_diff>

<commit_message>
docs: put the games in the submission document as a bonus feature
The brief awards marks for anything built beyond the requirements, and the games were not
in the document at all. Four short paragraphs in the first person, with the other things
the order screen does, before the cancel window.

What they are, that they are offered rather than pushed, and the two rules that shaped
them: the countdown never goes behind the game, and nothing is stored. The second is the
one worth saying out loud, because a reader could otherwise take it for something I did
not get round to rather than a decision. A half-finished board restored beside an order
that has since been served is worse than a lost game, and the countdown underneath already
survives a refresh, which is the state that actually matters.

The closing list of what was built beyond the requirements names them too. Fifteen pages,
both files regenerated and read back.
</commit_message>
<xml_diff>
--- a/docs/submission/CHOWLY-submission.docx
+++ b/docs/submission/CHOWLY-submission.docx
@@ -296,6 +296,14 @@
         </w:rPr>
         <w:br/>
         <w:t xml:space="preserve">        Payment</w:t>
+      </w:r>
+      <w:r>
+        <w:rPr>
+          <w:color w:val="5A5A5A"/>
+          <w:sz w:val="19"/>
+        </w:rPr>
+        <w:br/>
+        <w:t xml:space="preserve">        Something to do while you wait, which is beyond the requirements</w:t>
       </w:r>
       <w:r>
         <w:rPr>
@@ -3088,6 +3096,76 @@
         <w:pStyle w:val="Heading3"/>
       </w:pPr>
       <w:r>
+        <w:t>Something to do while you wait, which is beyond the requirements</w:t>
+      </w:r>
+    </w:p>
+    <w:p>
+      <w:pPr>
+        <w:jc w:val="both"/>
+      </w:pPr>
+      <w:r>
+        <w:rPr>
+          <w:b w:val="0"/>
+        </w:rPr>
+        <w:t>The wait is the thing this app is about, so I gave a guest something to do inside it. Once an order is placed there is one quiet control on the order screen, "Play while you wait", and it opens a small panel over that screen with two games in it. Tic tac toe, alone against the app or two people passing the phone across the table, and a quiz of forty eight questions on Lagos and Nigeria, food and cooking, and general knowledge, again alone or two people taking turns. Nothing repeats within a sitting, and the right answer is shown after every question.</w:t>
+      </w:r>
+    </w:p>
+    <w:p>
+      <w:pPr>
+        <w:jc w:val="both"/>
+      </w:pPr>
+      <w:r>
+        <w:rPr>
+          <w:b w:val="0"/>
+        </w:rPr>
+        <w:t>It is offered rather than pushed. One control, easy to ignore, gone the moment there is nothing left to wait for, and it closes on a single tap with nothing asked.</w:t>
+      </w:r>
+    </w:p>
+    <w:p>
+      <w:pPr>
+        <w:jc w:val="both"/>
+      </w:pPr>
+      <w:r>
+        <w:rPr>
+          <w:b w:val="0"/>
+        </w:rPr>
+        <w:t xml:space="preserve">Two rules shaped the rest of it. </w:t>
+      </w:r>
+      <w:r>
+        <w:rPr>
+          <w:b/>
+        </w:rPr>
+        <w:t>The countdown never goes behind the game.</w:t>
+      </w:r>
+      <w:r>
+        <w:rPr>
+          <w:b w:val="0"/>
+        </w:rPr>
+        <w:t xml:space="preserve"> The panel is capped against the ring rather than at a share of the screen, so it can never rise above it on any phone, and there is no dimming over it. If the order is served, runs late or is cancelled while someone is playing, a band appears over the game saying so with a way straight back. The wait is the subject; a game is not allowed to hide it.</w:t>
+      </w:r>
+    </w:p>
+    <w:p>
+      <w:pPr>
+        <w:jc w:val="both"/>
+      </w:pPr>
+      <w:r>
+        <w:rPr>
+          <w:b/>
+        </w:rPr>
+        <w:t>And nothing is stored.</w:t>
+      </w:r>
+      <w:r>
+        <w:rPr>
+          <w:b w:val="0"/>
+        </w:rPr>
+        <w:t xml:space="preserve"> A refresh closes the game and the next one starts clean. That is a decision rather than something I did not get to: a half-finished board restored beside an order that has since been served is worse than a lost game of tic tac toe, and the countdown underneath survives a refresh exactly as it always did, which is the state that actually matters. The games touch no table, no route and no request; they are entirely in the browser.</w:t>
+      </w:r>
+    </w:p>
+    <w:p>
+      <w:pPr>
+        <w:pStyle w:val="Heading3"/>
+      </w:pPr>
+      <w:r>
         <w:t>Cancelling an order, which is beyond the requirements</w:t>
       </w:r>
     </w:p>
@@ -3724,7 +3802,7 @@
         <w:rPr>
           <w:b w:val="0"/>
         </w:rPr>
-        <w:t>Beyond them I built the cancel window, the 86 board, the table board, the receipt as a saveable picture, the staff derived from the stations, the role switch, and the design, which is one art direction I chose over three I built and rejected.</w:t>
+        <w:t>Beyond them I built the cancel window, the two games to play while an order is on its way, the 86 board, the table board, the receipt as a saveable picture, the staff derived from the stations, the role switch, and the design, which is one art direction I chose over three I built and rejected.</w:t>
       </w:r>
     </w:p>
     <w:sectPr>

</xml_diff>